<commit_message>
feat(nkvh-pct): tu bao huy/dung ve so, chan phieu phan xuong khac; chinh mau PCT Dien
Tien ich NKVH 1.0.3 + server:
- Huy phieu tren NKVH (Luu trong hop "Xac nhan huy phieu") -> tu huy phieu
  tren so, ly do theo NKVH; nhac truoc trong hop thoai.
- Dung phieu (su co thiet bi / tai nan lao dong) -> so ghi Tam dung, ly do
  "Dung tren NKVH: ...", GIU so (mode "stop" moi, stopNkvhPermit). Nut xac
  nhan du phong khi chua thay dong do.
- Phieu co Don vi QLVH khac PXVH1 (VH3 = PXVH2...) -> tien ich dung ngoai,
  server chan lay so.
- So NKVH tu sinh (.../NDDH-VH1) cho thay bang so cua so (co hoi).

Web PCT:
- Bo nut "Xuat Word" o chi tiet phieu (tai Word trong "Xem va in").
- PCT Dien muc 1.6: "Thoi gian: 2 gio 36 phut"; o Dia diem cong tac chuyen
  len buoc Thong tin; cap nhat mau Word PCT Dien.

Co-Authored-By: Claude Opus 5.5 <noreply@anthropic.com>
</commit_message>
<xml_diff>
--- a/templates/work-permit-electrical.docx
+++ b/templates/work-permit-electrical.docx
@@ -422,7 +422,23 @@
           <w:sz w:val="24"/>
           <w:szCs w:val="24"/>
         </w:rPr>
-        <w:t>ngày {{startDate}}. Giờ: {{startDate}}</w:t>
+        <w:t xml:space="preserve">ngày {{startDate}}. </w:t>
+      </w:r>
+      <w:r>
+        <w:rPr>
+          <w:rFonts w:cs="Times New Roman"/>
+          <w:sz w:val="24"/>
+          <w:szCs w:val="24"/>
+        </w:rPr>
+        <w:t>Thời gian</w:t>
+      </w:r>
+      <w:r>
+        <w:rPr>
+          <w:rFonts w:cs="Times New Roman"/>
+          <w:sz w:val="24"/>
+          <w:szCs w:val="24"/>
+        </w:rPr>
+        <w:t>: {{startDate}}</w:t>
       </w:r>
     </w:p>
     <w:p>
@@ -465,7 +481,23 @@
           <w:sz w:val="24"/>
           <w:szCs w:val="24"/>
         </w:rPr>
-        <w:t xml:space="preserve">{{endDate}}. Giờ: {{endHour}} </w:t>
+        <w:t xml:space="preserve">{{endDate}}. </w:t>
+      </w:r>
+      <w:r>
+        <w:rPr>
+          <w:rFonts w:cs="Times New Roman"/>
+          <w:sz w:val="24"/>
+          <w:szCs w:val="24"/>
+        </w:rPr>
+        <w:t>Thời gian</w:t>
+      </w:r>
+      <w:r>
+        <w:rPr>
+          <w:rFonts w:cs="Times New Roman"/>
+          <w:sz w:val="24"/>
+          <w:szCs w:val="24"/>
+        </w:rPr>
+        <w:t xml:space="preserve">: {{endHour}} </w:t>
       </w:r>
     </w:p>
     <w:p>
@@ -932,18 +964,8 @@
           <w:sz w:val="24"/>
           <w:szCs w:val="24"/>
         </w:rPr>
-        <w:t>………………. Ký/xác nhận…………</w:t>
+        <w:t>………………. Ký/xác nhận……………..</w:t>
       </w:r>
-      <w:proofErr w:type="gramStart"/>
-      <w:r>
-        <w:rPr>
-          <w:rFonts w:cs="Times New Roman"/>
-          <w:sz w:val="24"/>
-          <w:szCs w:val="24"/>
-        </w:rPr>
-        <w:t>…..</w:t>
-      </w:r>
-      <w:proofErr w:type="gramEnd"/>
     </w:p>
     <w:p>
       <w:pPr>
@@ -4314,7 +4336,6 @@
         </w:rPr>
         <w:t xml:space="preserve">2.6. Cho phép đơn vị công tác bắt đầu làm việc lúc ...giờ ... phút, ngày </w:t>
       </w:r>
-      <w:proofErr w:type="gramStart"/>
       <w:r>
         <w:rPr>
           <w:rFonts w:cs="Times New Roman"/>
@@ -4329,18 +4350,8 @@
           <w:sz w:val="24"/>
           <w:szCs w:val="24"/>
         </w:rPr>
-        <w:t>..</w:t>
+        <w:t xml:space="preserve">.. tháng </w:t>
       </w:r>
-      <w:proofErr w:type="gramEnd"/>
-      <w:r>
-        <w:rPr>
-          <w:rFonts w:cs="Times New Roman"/>
-          <w:sz w:val="24"/>
-          <w:szCs w:val="24"/>
-        </w:rPr>
-        <w:t xml:space="preserve"> tháng </w:t>
-      </w:r>
-      <w:proofErr w:type="gramStart"/>
       <w:r>
         <w:rPr>
           <w:rFonts w:cs="Times New Roman"/>
@@ -4355,16 +4366,7 @@
           <w:sz w:val="24"/>
           <w:szCs w:val="24"/>
         </w:rPr>
-        <w:t>..</w:t>
-      </w:r>
-      <w:proofErr w:type="gramEnd"/>
-      <w:r>
-        <w:rPr>
-          <w:rFonts w:cs="Times New Roman"/>
-          <w:sz w:val="24"/>
-          <w:szCs w:val="24"/>
-        </w:rPr>
-        <w:t xml:space="preserve"> năm</w:t>
+        <w:t>.. năm</w:t>
       </w:r>
     </w:p>
     <w:p>
@@ -4405,7 +4407,6 @@
         </w:rPr>
         <w:t>Họ và tên……………………</w:t>
       </w:r>
-      <w:proofErr w:type="gramStart"/>
       <w:r>
         <w:rPr>
           <w:rFonts w:cs="Times New Roman"/>
@@ -4414,32 +4415,13 @@
         </w:rPr>
         <w:t>…..</w:t>
       </w:r>
-      <w:proofErr w:type="gramEnd"/>
       <w:r>
         <w:rPr>
           <w:rFonts w:cs="Times New Roman"/>
           <w:sz w:val="24"/>
           <w:szCs w:val="24"/>
         </w:rPr>
-        <w:t xml:space="preserve">chức </w:t>
-      </w:r>
-      <w:proofErr w:type="gramStart"/>
-      <w:r>
-        <w:rPr>
-          <w:rFonts w:cs="Times New Roman"/>
-          <w:sz w:val="24"/>
-          <w:szCs w:val="24"/>
-        </w:rPr>
-        <w:t>vụ:…</w:t>
-      </w:r>
-      <w:proofErr w:type="gramEnd"/>
-      <w:r>
-        <w:rPr>
-          <w:rFonts w:cs="Times New Roman"/>
-          <w:sz w:val="24"/>
-          <w:szCs w:val="24"/>
-        </w:rPr>
-        <w:t>…</w:t>
+        <w:t>chức vụ:……</w:t>
       </w:r>
       <w:r>
         <w:rPr>
@@ -4447,18 +4429,8 @@
           <w:sz w:val="24"/>
           <w:szCs w:val="24"/>
         </w:rPr>
-        <w:t>……</w:t>
+        <w:t>………..</w:t>
       </w:r>
-      <w:proofErr w:type="gramStart"/>
-      <w:r>
-        <w:rPr>
-          <w:rFonts w:cs="Times New Roman"/>
-          <w:sz w:val="24"/>
-          <w:szCs w:val="24"/>
-        </w:rPr>
-        <w:t>…..</w:t>
-      </w:r>
-      <w:proofErr w:type="gramEnd"/>
       <w:r>
         <w:rPr>
           <w:rFonts w:cs="Times New Roman"/>
@@ -4473,18 +4445,8 @@
           <w:sz w:val="24"/>
           <w:szCs w:val="24"/>
         </w:rPr>
-        <w:t>……………</w:t>
+        <w:t>………………..</w:t>
       </w:r>
-      <w:proofErr w:type="gramStart"/>
-      <w:r>
-        <w:rPr>
-          <w:rFonts w:cs="Times New Roman"/>
-          <w:sz w:val="24"/>
-          <w:szCs w:val="24"/>
-        </w:rPr>
-        <w:t>…..</w:t>
-      </w:r>
-      <w:proofErr w:type="gramEnd"/>
     </w:p>
     <w:p>
       <w:pPr>
@@ -5313,16 +5275,7 @@
           <w:sz w:val="24"/>
           <w:szCs w:val="24"/>
         </w:rPr>
-        <w:t xml:space="preserve">Bắt đầu tiến hành công việc lúc </w:t>
-      </w:r>
-      <w:proofErr w:type="gramStart"/>
-      <w:r>
-        <w:rPr>
-          <w:rFonts w:cs="Times New Roman"/>
-          <w:sz w:val="24"/>
-          <w:szCs w:val="24"/>
-        </w:rPr>
-        <w:t>...</w:t>
+        <w:t>Bắt đầu tiến hành công việc lúc ...</w:t>
       </w:r>
       <w:r>
         <w:rPr>
@@ -5338,16 +5291,7 @@
           <w:sz w:val="24"/>
           <w:szCs w:val="24"/>
         </w:rPr>
-        <w:t>giờ</w:t>
-      </w:r>
-      <w:proofErr w:type="gramEnd"/>
-      <w:r>
-        <w:rPr>
-          <w:rFonts w:cs="Times New Roman"/>
-          <w:sz w:val="24"/>
-          <w:szCs w:val="24"/>
-        </w:rPr>
-        <w:t xml:space="preserve"> ...</w:t>
+        <w:t>giờ ...</w:t>
       </w:r>
       <w:r>
         <w:rPr>
@@ -5424,19 +5368,8 @@
           <w:sz w:val="24"/>
           <w:szCs w:val="24"/>
         </w:rPr>
-        <w:t xml:space="preserve">(ký/xác </w:t>
+        <w:t>(ký/xác nhận )</w:t>
       </w:r>
-      <w:proofErr w:type="gramStart"/>
-      <w:r>
-        <w:rPr>
-          <w:rFonts w:cs="Times New Roman"/>
-          <w:i/>
-          <w:sz w:val="24"/>
-          <w:szCs w:val="24"/>
-        </w:rPr>
-        <w:t>nhận )</w:t>
-      </w:r>
-      <w:proofErr w:type="gramEnd"/>
       <w:r>
         <w:rPr>
           <w:rFonts w:cs="Times New Roman"/>
@@ -5464,25 +5397,7 @@
           <w:sz w:val="24"/>
           <w:szCs w:val="24"/>
         </w:rPr>
-        <w:t xml:space="preserve">Họ và tên………………… chức </w:t>
-      </w:r>
-      <w:proofErr w:type="gramStart"/>
-      <w:r>
-        <w:rPr>
-          <w:rFonts w:cs="Times New Roman"/>
-          <w:sz w:val="24"/>
-          <w:szCs w:val="24"/>
-        </w:rPr>
-        <w:t>vụ:…</w:t>
-      </w:r>
-      <w:proofErr w:type="gramEnd"/>
-      <w:r>
-        <w:rPr>
-          <w:rFonts w:cs="Times New Roman"/>
-          <w:sz w:val="24"/>
-          <w:szCs w:val="24"/>
-        </w:rPr>
-        <w:t xml:space="preserve">…………Ký/xác nhận: </w:t>
+        <w:t xml:space="preserve">Họ và tên………………… chức vụ:……………Ký/xác nhận: </w:t>
       </w:r>
       <w:r>
         <w:rPr>
@@ -5518,27 +5433,7 @@
           <w:sz w:val="24"/>
           <w:szCs w:val="24"/>
         </w:rPr>
-        <w:t xml:space="preserve">(ký/xác </w:t>
-      </w:r>
-      <w:proofErr w:type="gramStart"/>
-      <w:r>
-        <w:rPr>
-          <w:rFonts w:cs="Times New Roman"/>
-          <w:i/>
-          <w:sz w:val="24"/>
-          <w:szCs w:val="24"/>
-        </w:rPr>
-        <w:t>nhận  -</w:t>
-      </w:r>
-      <w:proofErr w:type="gramEnd"/>
-      <w:r>
-        <w:rPr>
-          <w:rFonts w:cs="Times New Roman"/>
-          <w:i/>
-          <w:sz w:val="24"/>
-          <w:szCs w:val="24"/>
-        </w:rPr>
-        <w:t xml:space="preserve"> nếu có)</w:t>
+        <w:t>(ký/xác nhận  - nếu có)</w:t>
       </w:r>
       <w:r>
         <w:rPr>
@@ -5566,61 +5461,7 @@
           <w:sz w:val="24"/>
           <w:szCs w:val="24"/>
         </w:rPr>
-        <w:t xml:space="preserve">Họ và tên…………………… chức </w:t>
-      </w:r>
-      <w:proofErr w:type="gramStart"/>
-      <w:r>
-        <w:rPr>
-          <w:rFonts w:cs="Times New Roman"/>
-          <w:sz w:val="24"/>
-          <w:szCs w:val="24"/>
-        </w:rPr>
-        <w:t>vụ:…</w:t>
-      </w:r>
-      <w:proofErr w:type="gramEnd"/>
-      <w:r>
-        <w:rPr>
-          <w:rFonts w:cs="Times New Roman"/>
-          <w:sz w:val="24"/>
-          <w:szCs w:val="24"/>
-        </w:rPr>
-        <w:t>……</w:t>
-      </w:r>
-      <w:proofErr w:type="gramStart"/>
-      <w:r>
-        <w:rPr>
-          <w:rFonts w:cs="Times New Roman"/>
-          <w:sz w:val="24"/>
-          <w:szCs w:val="24"/>
-        </w:rPr>
-        <w:t>…..</w:t>
-      </w:r>
-      <w:proofErr w:type="gramEnd"/>
-      <w:r>
-        <w:rPr>
-          <w:rFonts w:cs="Times New Roman"/>
-          <w:sz w:val="24"/>
-          <w:szCs w:val="24"/>
-        </w:rPr>
-        <w:t xml:space="preserve">Ký/xác </w:t>
-      </w:r>
-      <w:proofErr w:type="gramStart"/>
-      <w:r>
-        <w:rPr>
-          <w:rFonts w:cs="Times New Roman"/>
-          <w:sz w:val="24"/>
-          <w:szCs w:val="24"/>
-        </w:rPr>
-        <w:t>nhận :</w:t>
-      </w:r>
-      <w:proofErr w:type="gramEnd"/>
-      <w:r>
-        <w:rPr>
-          <w:rFonts w:cs="Times New Roman"/>
-          <w:sz w:val="24"/>
-          <w:szCs w:val="24"/>
-        </w:rPr>
-        <w:t xml:space="preserve"> </w:t>
+        <w:t xml:space="preserve">Họ và tên…………………… chức vụ:…………..Ký/xác nhận : </w:t>
       </w:r>
       <w:r>
         <w:rPr>
@@ -5628,18 +5469,8 @@
           <w:sz w:val="24"/>
           <w:szCs w:val="24"/>
         </w:rPr>
-        <w:t>………</w:t>
+        <w:t>…………..</w:t>
       </w:r>
-      <w:proofErr w:type="gramStart"/>
-      <w:r>
-        <w:rPr>
-          <w:rFonts w:cs="Times New Roman"/>
-          <w:sz w:val="24"/>
-          <w:szCs w:val="24"/>
-        </w:rPr>
-        <w:t>…..</w:t>
-      </w:r>
-      <w:proofErr w:type="gramEnd"/>
     </w:p>
     <w:p>
       <w:pPr>
@@ -11814,18 +11645,8 @@
           <w:sz w:val="24"/>
           <w:szCs w:val="24"/>
         </w:rPr>
-        <w:t>6.1. Toàn bộ công tác đã kết thúc, dụng cụ đã thu dọn, người, tiếp đất và biện pháp an toàn do đơn vị công tác làm đã rút hết bảo đảm an toàn đóng điện. Người chỉ huy trực tiếp đơn vị công tác trả lại nơi làm việc cho Người cho phép…………………… chức vụ……………. đại diện đơn vị quản lý lúc……. giờ……… ngày……………. tháng………… năm……</w:t>
+        <w:t>6.1. Toàn bộ công tác đã kết thúc, dụng cụ đã thu dọn, người, tiếp đất và biện pháp an toàn do đơn vị công tác làm đã rút hết bảo đảm an toàn đóng điện. Người chỉ huy trực tiếp đơn vị công tác trả lại nơi làm việc cho Người cho phép…………………… chức vụ……………. đại diện đơn vị quản lý lúc……. giờ……… ngày……………. tháng………… năm………..</w:t>
       </w:r>
-      <w:proofErr w:type="gramStart"/>
-      <w:r>
-        <w:rPr>
-          <w:rFonts w:cs="Times New Roman"/>
-          <w:sz w:val="24"/>
-          <w:szCs w:val="24"/>
-        </w:rPr>
-        <w:t>…..</w:t>
-      </w:r>
-      <w:proofErr w:type="gramEnd"/>
     </w:p>
     <w:p>
       <w:pPr>

</xml_diff>